<commit_message>
Leistungskontrolle: Aufgabe 3 fest auf der Rückseite (Seitenumbruch)
Co-Authored-By: Claude Opus 5.5 <noreply@anthropic.com>
Claude-Session: https://claude.ai/code/session_01KXvLXHMYPnCyEbMRgNaaYs
</commit_message>
<xml_diff>
--- a/Deutsch_7A/Leistungskontrolle_Verben/LK_Verben_Gruppe_A.docx
+++ b/Deutsch_7A/Leistungskontrolle_Verben/LK_Verben_Gruppe_A.docx
@@ -2208,6 +2208,11 @@
         </w:tc>
       </w:tr>
     </w:tbl>
+    <w:p>
+      <w:r>
+        <w:br w:type="page"/>
+      </w:r>
+    </w:p>
     <w:p>
       <w:pPr>
         <w:keepNext/>

</xml_diff>

<commit_message>
Leistungskontrolle: Lösungsblätter A und B; Spalte Tempus verbreitert
Co-Authored-By: Claude Opus 5.5 <noreply@anthropic.com>
Claude-Session: https://claude.ai/code/session_01KXvLXHMYPnCyEbMRgNaaYs
</commit_message>
<xml_diff>
--- a/Deutsch_7A/Leistungskontrolle_Verben/LK_Verben_Gruppe_A.docx
+++ b/Deutsch_7A/Leistungskontrolle_Verben/LK_Verben_Gruppe_A.docx
@@ -1213,9 +1213,9 @@
       </w:tblPr>
       <w:tblGrid>
         <w:gridCol w:w="4606"/>
-        <w:gridCol w:w="1900"/>
-        <w:gridCol w:w="1900"/>
-        <w:gridCol w:w="1900"/>
+        <w:gridCol w:w="1500"/>
+        <w:gridCol w:w="1700"/>
+        <w:gridCol w:w="2500"/>
       </w:tblGrid>
       <w:tr>
         <w:trPr>
@@ -1260,7 +1260,7 @@
         </w:tc>
         <w:tc>
           <w:tcPr>
-            <w:tcW w:type="dxa" w:w="1900"/>
+            <w:tcW w:type="dxa" w:w="1500"/>
             <w:tcBorders>
               <w:top w:val="single" w:color="7A869E" w:sz="8"/>
               <w:left w:val="single" w:color="7A869E" w:sz="8"/>
@@ -1296,7 +1296,7 @@
         </w:tc>
         <w:tc>
           <w:tcPr>
-            <w:tcW w:type="dxa" w:w="1900"/>
+            <w:tcW w:type="dxa" w:w="1700"/>
             <w:tcBorders>
               <w:top w:val="single" w:color="7A869E" w:sz="8"/>
               <w:left w:val="single" w:color="7A869E" w:sz="8"/>
@@ -1332,7 +1332,7 @@
         </w:tc>
         <w:tc>
           <w:tcPr>
-            <w:tcW w:type="dxa" w:w="1900"/>
+            <w:tcW w:type="dxa" w:w="2500"/>
             <w:tcBorders>
               <w:top w:val="single" w:color="7A869E" w:sz="8"/>
               <w:left w:val="single" w:color="7A869E" w:sz="8"/>
@@ -1427,7 +1427,7 @@
         </w:tc>
         <w:tc>
           <w:tcPr>
-            <w:tcW w:type="dxa" w:w="1900"/>
+            <w:tcW w:type="dxa" w:w="1500"/>
             <w:tcBorders>
               <w:top w:val="single" w:color="7A869E" w:sz="8"/>
               <w:left w:val="single" w:color="7A869E" w:sz="8"/>
@@ -1462,7 +1462,7 @@
         </w:tc>
         <w:tc>
           <w:tcPr>
-            <w:tcW w:type="dxa" w:w="1900"/>
+            <w:tcW w:type="dxa" w:w="1700"/>
             <w:tcBorders>
               <w:top w:val="single" w:color="7A869E" w:sz="8"/>
               <w:left w:val="single" w:color="7A869E" w:sz="8"/>
@@ -1497,7 +1497,7 @@
         </w:tc>
         <w:tc>
           <w:tcPr>
-            <w:tcW w:type="dxa" w:w="1900"/>
+            <w:tcW w:type="dxa" w:w="2500"/>
             <w:tcBorders>
               <w:top w:val="single" w:color="7A869E" w:sz="8"/>
               <w:left w:val="single" w:color="7A869E" w:sz="8"/>
@@ -1610,29 +1610,31 @@
         </w:tc>
         <w:tc>
           <w:tcPr>
-            <w:tcW w:type="dxa" w:w="1900"/>
-            <w:tcBorders>
-              <w:top w:val="single" w:color="7A869E" w:sz="8"/>
-              <w:left w:val="single" w:color="7A869E" w:sz="8"/>
-              <w:bottom w:val="single" w:color="7A869E" w:sz="8"/>
-              <w:right w:val="single" w:color="7A869E" w:sz="8"/>
-            </w:tcBorders>
-            <w:tcMar>
-              <w:top w:type="dxa" w:w="50"/>
-              <w:left w:type="dxa" w:w="90"/>
-              <w:bottom w:type="dxa" w:w="50"/>
-              <w:right w:type="dxa" w:w="100"/>
-            </w:tcMar>
-            <w:vAlign w:val="center"/>
-          </w:tcPr>
-          <w:p>
-            <w:pPr>
-              <w:spacing w:after="0" w:before="0"/>
-            </w:pPr>
-            <w:r>
-              <w:rPr>
-                <w:rFonts w:ascii="Calibri" w:cs="Calibri" w:eastAsia="Calibri" w:hAnsi="Calibri"/>
-                <w:color w:val="000000"/>
+            <w:tcW w:type="dxa" w:w="1500"/>
+            <w:tcBorders>
+              <w:top w:val="single" w:color="7A869E" w:sz="8"/>
+              <w:left w:val="single" w:color="7A869E" w:sz="8"/>
+              <w:bottom w:val="single" w:color="7A869E" w:sz="8"/>
+              <w:right w:val="single" w:color="7A869E" w:sz="8"/>
+            </w:tcBorders>
+            <w:tcMar>
+              <w:top w:type="dxa" w:w="50"/>
+              <w:left w:type="dxa" w:w="90"/>
+              <w:bottom w:type="dxa" w:w="50"/>
+              <w:right w:type="dxa" w:w="100"/>
+            </w:tcMar>
+            <w:vAlign w:val="center"/>
+          </w:tcPr>
+          <w:p>
+            <w:pPr>
+              <w:spacing w:after="0" w:before="0"/>
+            </w:pPr>
+            <w:r>
+              <w:rPr>
+                <w:rFonts w:ascii="Calibri" w:cs="Calibri" w:eastAsia="Calibri" w:hAnsi="Calibri"/>
+                <w:i/>
+                <w:iCs/>
+                <w:color w:val="1E7B4A"/>
                 <w:sz w:val="22"/>
                 <w:szCs w:val="22"/>
               </w:rPr>
@@ -1642,29 +1644,31 @@
         </w:tc>
         <w:tc>
           <w:tcPr>
-            <w:tcW w:type="dxa" w:w="1900"/>
-            <w:tcBorders>
-              <w:top w:val="single" w:color="7A869E" w:sz="8"/>
-              <w:left w:val="single" w:color="7A869E" w:sz="8"/>
-              <w:bottom w:val="single" w:color="7A869E" w:sz="8"/>
-              <w:right w:val="single" w:color="7A869E" w:sz="8"/>
-            </w:tcBorders>
-            <w:tcMar>
-              <w:top w:type="dxa" w:w="50"/>
-              <w:left w:type="dxa" w:w="90"/>
-              <w:bottom w:type="dxa" w:w="50"/>
-              <w:right w:type="dxa" w:w="100"/>
-            </w:tcMar>
-            <w:vAlign w:val="center"/>
-          </w:tcPr>
-          <w:p>
-            <w:pPr>
-              <w:spacing w:after="0" w:before="0"/>
-            </w:pPr>
-            <w:r>
-              <w:rPr>
-                <w:rFonts w:ascii="Calibri" w:cs="Calibri" w:eastAsia="Calibri" w:hAnsi="Calibri"/>
-                <w:color w:val="000000"/>
+            <w:tcW w:type="dxa" w:w="1700"/>
+            <w:tcBorders>
+              <w:top w:val="single" w:color="7A869E" w:sz="8"/>
+              <w:left w:val="single" w:color="7A869E" w:sz="8"/>
+              <w:bottom w:val="single" w:color="7A869E" w:sz="8"/>
+              <w:right w:val="single" w:color="7A869E" w:sz="8"/>
+            </w:tcBorders>
+            <w:tcMar>
+              <w:top w:type="dxa" w:w="50"/>
+              <w:left w:type="dxa" w:w="90"/>
+              <w:bottom w:type="dxa" w:w="50"/>
+              <w:right w:type="dxa" w:w="100"/>
+            </w:tcMar>
+            <w:vAlign w:val="center"/>
+          </w:tcPr>
+          <w:p>
+            <w:pPr>
+              <w:spacing w:after="0" w:before="0"/>
+            </w:pPr>
+            <w:r>
+              <w:rPr>
+                <w:rFonts w:ascii="Calibri" w:cs="Calibri" w:eastAsia="Calibri" w:hAnsi="Calibri"/>
+                <w:i/>
+                <w:iCs/>
+                <w:color w:val="1E7B4A"/>
                 <w:sz w:val="22"/>
                 <w:szCs w:val="22"/>
               </w:rPr>
@@ -1674,29 +1678,31 @@
         </w:tc>
         <w:tc>
           <w:tcPr>
-            <w:tcW w:type="dxa" w:w="1900"/>
-            <w:tcBorders>
-              <w:top w:val="single" w:color="7A869E" w:sz="8"/>
-              <w:left w:val="single" w:color="7A869E" w:sz="8"/>
-              <w:bottom w:val="single" w:color="7A869E" w:sz="8"/>
-              <w:right w:val="single" w:color="7A869E" w:sz="8"/>
-            </w:tcBorders>
-            <w:tcMar>
-              <w:top w:type="dxa" w:w="50"/>
-              <w:left w:type="dxa" w:w="90"/>
-              <w:bottom w:type="dxa" w:w="50"/>
-              <w:right w:type="dxa" w:w="100"/>
-            </w:tcMar>
-            <w:vAlign w:val="center"/>
-          </w:tcPr>
-          <w:p>
-            <w:pPr>
-              <w:spacing w:after="0" w:before="0"/>
-            </w:pPr>
-            <w:r>
-              <w:rPr>
-                <w:rFonts w:ascii="Calibri" w:cs="Calibri" w:eastAsia="Calibri" w:hAnsi="Calibri"/>
-                <w:color w:val="000000"/>
+            <w:tcW w:type="dxa" w:w="2500"/>
+            <w:tcBorders>
+              <w:top w:val="single" w:color="7A869E" w:sz="8"/>
+              <w:left w:val="single" w:color="7A869E" w:sz="8"/>
+              <w:bottom w:val="single" w:color="7A869E" w:sz="8"/>
+              <w:right w:val="single" w:color="7A869E" w:sz="8"/>
+            </w:tcBorders>
+            <w:tcMar>
+              <w:top w:type="dxa" w:w="50"/>
+              <w:left w:type="dxa" w:w="90"/>
+              <w:bottom w:type="dxa" w:w="50"/>
+              <w:right w:type="dxa" w:w="100"/>
+            </w:tcMar>
+            <w:vAlign w:val="center"/>
+          </w:tcPr>
+          <w:p>
+            <w:pPr>
+              <w:spacing w:after="0" w:before="0"/>
+            </w:pPr>
+            <w:r>
+              <w:rPr>
+                <w:rFonts w:ascii="Calibri" w:cs="Calibri" w:eastAsia="Calibri" w:hAnsi="Calibri"/>
+                <w:i/>
+                <w:iCs/>
+                <w:color w:val="1E7B4A"/>
                 <w:sz w:val="22"/>
                 <w:szCs w:val="22"/>
               </w:rPr>
@@ -1764,29 +1770,31 @@
         </w:tc>
         <w:tc>
           <w:tcPr>
-            <w:tcW w:type="dxa" w:w="1900"/>
-            <w:tcBorders>
-              <w:top w:val="single" w:color="7A869E" w:sz="8"/>
-              <w:left w:val="single" w:color="7A869E" w:sz="8"/>
-              <w:bottom w:val="single" w:color="7A869E" w:sz="8"/>
-              <w:right w:val="single" w:color="7A869E" w:sz="8"/>
-            </w:tcBorders>
-            <w:tcMar>
-              <w:top w:type="dxa" w:w="50"/>
-              <w:left w:type="dxa" w:w="90"/>
-              <w:bottom w:type="dxa" w:w="50"/>
-              <w:right w:type="dxa" w:w="100"/>
-            </w:tcMar>
-            <w:vAlign w:val="center"/>
-          </w:tcPr>
-          <w:p>
-            <w:pPr>
-              <w:spacing w:after="0" w:before="0"/>
-            </w:pPr>
-            <w:r>
-              <w:rPr>
-                <w:rFonts w:ascii="Calibri" w:cs="Calibri" w:eastAsia="Calibri" w:hAnsi="Calibri"/>
-                <w:color w:val="000000"/>
+            <w:tcW w:type="dxa" w:w="1500"/>
+            <w:tcBorders>
+              <w:top w:val="single" w:color="7A869E" w:sz="8"/>
+              <w:left w:val="single" w:color="7A869E" w:sz="8"/>
+              <w:bottom w:val="single" w:color="7A869E" w:sz="8"/>
+              <w:right w:val="single" w:color="7A869E" w:sz="8"/>
+            </w:tcBorders>
+            <w:tcMar>
+              <w:top w:type="dxa" w:w="50"/>
+              <w:left w:type="dxa" w:w="90"/>
+              <w:bottom w:type="dxa" w:w="50"/>
+              <w:right w:type="dxa" w:w="100"/>
+            </w:tcMar>
+            <w:vAlign w:val="center"/>
+          </w:tcPr>
+          <w:p>
+            <w:pPr>
+              <w:spacing w:after="0" w:before="0"/>
+            </w:pPr>
+            <w:r>
+              <w:rPr>
+                <w:rFonts w:ascii="Calibri" w:cs="Calibri" w:eastAsia="Calibri" w:hAnsi="Calibri"/>
+                <w:i/>
+                <w:iCs/>
+                <w:color w:val="1E7B4A"/>
                 <w:sz w:val="22"/>
                 <w:szCs w:val="22"/>
               </w:rPr>
@@ -1796,29 +1804,31 @@
         </w:tc>
         <w:tc>
           <w:tcPr>
-            <w:tcW w:type="dxa" w:w="1900"/>
-            <w:tcBorders>
-              <w:top w:val="single" w:color="7A869E" w:sz="8"/>
-              <w:left w:val="single" w:color="7A869E" w:sz="8"/>
-              <w:bottom w:val="single" w:color="7A869E" w:sz="8"/>
-              <w:right w:val="single" w:color="7A869E" w:sz="8"/>
-            </w:tcBorders>
-            <w:tcMar>
-              <w:top w:type="dxa" w:w="50"/>
-              <w:left w:type="dxa" w:w="90"/>
-              <w:bottom w:type="dxa" w:w="50"/>
-              <w:right w:type="dxa" w:w="100"/>
-            </w:tcMar>
-            <w:vAlign w:val="center"/>
-          </w:tcPr>
-          <w:p>
-            <w:pPr>
-              <w:spacing w:after="0" w:before="0"/>
-            </w:pPr>
-            <w:r>
-              <w:rPr>
-                <w:rFonts w:ascii="Calibri" w:cs="Calibri" w:eastAsia="Calibri" w:hAnsi="Calibri"/>
-                <w:color w:val="000000"/>
+            <w:tcW w:type="dxa" w:w="1700"/>
+            <w:tcBorders>
+              <w:top w:val="single" w:color="7A869E" w:sz="8"/>
+              <w:left w:val="single" w:color="7A869E" w:sz="8"/>
+              <w:bottom w:val="single" w:color="7A869E" w:sz="8"/>
+              <w:right w:val="single" w:color="7A869E" w:sz="8"/>
+            </w:tcBorders>
+            <w:tcMar>
+              <w:top w:type="dxa" w:w="50"/>
+              <w:left w:type="dxa" w:w="90"/>
+              <w:bottom w:type="dxa" w:w="50"/>
+              <w:right w:type="dxa" w:w="100"/>
+            </w:tcMar>
+            <w:vAlign w:val="center"/>
+          </w:tcPr>
+          <w:p>
+            <w:pPr>
+              <w:spacing w:after="0" w:before="0"/>
+            </w:pPr>
+            <w:r>
+              <w:rPr>
+                <w:rFonts w:ascii="Calibri" w:cs="Calibri" w:eastAsia="Calibri" w:hAnsi="Calibri"/>
+                <w:i/>
+                <w:iCs/>
+                <w:color w:val="1E7B4A"/>
                 <w:sz w:val="22"/>
                 <w:szCs w:val="22"/>
               </w:rPr>
@@ -1828,29 +1838,31 @@
         </w:tc>
         <w:tc>
           <w:tcPr>
-            <w:tcW w:type="dxa" w:w="1900"/>
-            <w:tcBorders>
-              <w:top w:val="single" w:color="7A869E" w:sz="8"/>
-              <w:left w:val="single" w:color="7A869E" w:sz="8"/>
-              <w:bottom w:val="single" w:color="7A869E" w:sz="8"/>
-              <w:right w:val="single" w:color="7A869E" w:sz="8"/>
-            </w:tcBorders>
-            <w:tcMar>
-              <w:top w:type="dxa" w:w="50"/>
-              <w:left w:type="dxa" w:w="90"/>
-              <w:bottom w:type="dxa" w:w="50"/>
-              <w:right w:type="dxa" w:w="100"/>
-            </w:tcMar>
-            <w:vAlign w:val="center"/>
-          </w:tcPr>
-          <w:p>
-            <w:pPr>
-              <w:spacing w:after="0" w:before="0"/>
-            </w:pPr>
-            <w:r>
-              <w:rPr>
-                <w:rFonts w:ascii="Calibri" w:cs="Calibri" w:eastAsia="Calibri" w:hAnsi="Calibri"/>
-                <w:color w:val="000000"/>
+            <w:tcW w:type="dxa" w:w="2500"/>
+            <w:tcBorders>
+              <w:top w:val="single" w:color="7A869E" w:sz="8"/>
+              <w:left w:val="single" w:color="7A869E" w:sz="8"/>
+              <w:bottom w:val="single" w:color="7A869E" w:sz="8"/>
+              <w:right w:val="single" w:color="7A869E" w:sz="8"/>
+            </w:tcBorders>
+            <w:tcMar>
+              <w:top w:type="dxa" w:w="50"/>
+              <w:left w:type="dxa" w:w="90"/>
+              <w:bottom w:type="dxa" w:w="50"/>
+              <w:right w:type="dxa" w:w="100"/>
+            </w:tcMar>
+            <w:vAlign w:val="center"/>
+          </w:tcPr>
+          <w:p>
+            <w:pPr>
+              <w:spacing w:after="0" w:before="0"/>
+            </w:pPr>
+            <w:r>
+              <w:rPr>
+                <w:rFonts w:ascii="Calibri" w:cs="Calibri" w:eastAsia="Calibri" w:hAnsi="Calibri"/>
+                <w:i/>
+                <w:iCs/>
+                <w:color w:val="1E7B4A"/>
                 <w:sz w:val="22"/>
                 <w:szCs w:val="22"/>
               </w:rPr>
@@ -1938,29 +1950,31 @@
         </w:tc>
         <w:tc>
           <w:tcPr>
-            <w:tcW w:type="dxa" w:w="1900"/>
-            <w:tcBorders>
-              <w:top w:val="single" w:color="7A869E" w:sz="8"/>
-              <w:left w:val="single" w:color="7A869E" w:sz="8"/>
-              <w:bottom w:val="single" w:color="7A869E" w:sz="8"/>
-              <w:right w:val="single" w:color="7A869E" w:sz="8"/>
-            </w:tcBorders>
-            <w:tcMar>
-              <w:top w:type="dxa" w:w="50"/>
-              <w:left w:type="dxa" w:w="90"/>
-              <w:bottom w:type="dxa" w:w="50"/>
-              <w:right w:type="dxa" w:w="100"/>
-            </w:tcMar>
-            <w:vAlign w:val="center"/>
-          </w:tcPr>
-          <w:p>
-            <w:pPr>
-              <w:spacing w:after="0" w:before="0"/>
-            </w:pPr>
-            <w:r>
-              <w:rPr>
-                <w:rFonts w:ascii="Calibri" w:cs="Calibri" w:eastAsia="Calibri" w:hAnsi="Calibri"/>
-                <w:color w:val="000000"/>
+            <w:tcW w:type="dxa" w:w="1500"/>
+            <w:tcBorders>
+              <w:top w:val="single" w:color="7A869E" w:sz="8"/>
+              <w:left w:val="single" w:color="7A869E" w:sz="8"/>
+              <w:bottom w:val="single" w:color="7A869E" w:sz="8"/>
+              <w:right w:val="single" w:color="7A869E" w:sz="8"/>
+            </w:tcBorders>
+            <w:tcMar>
+              <w:top w:type="dxa" w:w="50"/>
+              <w:left w:type="dxa" w:w="90"/>
+              <w:bottom w:type="dxa" w:w="50"/>
+              <w:right w:type="dxa" w:w="100"/>
+            </w:tcMar>
+            <w:vAlign w:val="center"/>
+          </w:tcPr>
+          <w:p>
+            <w:pPr>
+              <w:spacing w:after="0" w:before="0"/>
+            </w:pPr>
+            <w:r>
+              <w:rPr>
+                <w:rFonts w:ascii="Calibri" w:cs="Calibri" w:eastAsia="Calibri" w:hAnsi="Calibri"/>
+                <w:i/>
+                <w:iCs/>
+                <w:color w:val="1E7B4A"/>
                 <w:sz w:val="22"/>
                 <w:szCs w:val="22"/>
               </w:rPr>
@@ -1970,29 +1984,31 @@
         </w:tc>
         <w:tc>
           <w:tcPr>
-            <w:tcW w:type="dxa" w:w="1900"/>
-            <w:tcBorders>
-              <w:top w:val="single" w:color="7A869E" w:sz="8"/>
-              <w:left w:val="single" w:color="7A869E" w:sz="8"/>
-              <w:bottom w:val="single" w:color="7A869E" w:sz="8"/>
-              <w:right w:val="single" w:color="7A869E" w:sz="8"/>
-            </w:tcBorders>
-            <w:tcMar>
-              <w:top w:type="dxa" w:w="50"/>
-              <w:left w:type="dxa" w:w="90"/>
-              <w:bottom w:type="dxa" w:w="50"/>
-              <w:right w:type="dxa" w:w="100"/>
-            </w:tcMar>
-            <w:vAlign w:val="center"/>
-          </w:tcPr>
-          <w:p>
-            <w:pPr>
-              <w:spacing w:after="0" w:before="0"/>
-            </w:pPr>
-            <w:r>
-              <w:rPr>
-                <w:rFonts w:ascii="Calibri" w:cs="Calibri" w:eastAsia="Calibri" w:hAnsi="Calibri"/>
-                <w:color w:val="000000"/>
+            <w:tcW w:type="dxa" w:w="1700"/>
+            <w:tcBorders>
+              <w:top w:val="single" w:color="7A869E" w:sz="8"/>
+              <w:left w:val="single" w:color="7A869E" w:sz="8"/>
+              <w:bottom w:val="single" w:color="7A869E" w:sz="8"/>
+              <w:right w:val="single" w:color="7A869E" w:sz="8"/>
+            </w:tcBorders>
+            <w:tcMar>
+              <w:top w:type="dxa" w:w="50"/>
+              <w:left w:type="dxa" w:w="90"/>
+              <w:bottom w:type="dxa" w:w="50"/>
+              <w:right w:type="dxa" w:w="100"/>
+            </w:tcMar>
+            <w:vAlign w:val="center"/>
+          </w:tcPr>
+          <w:p>
+            <w:pPr>
+              <w:spacing w:after="0" w:before="0"/>
+            </w:pPr>
+            <w:r>
+              <w:rPr>
+                <w:rFonts w:ascii="Calibri" w:cs="Calibri" w:eastAsia="Calibri" w:hAnsi="Calibri"/>
+                <w:i/>
+                <w:iCs/>
+                <w:color w:val="1E7B4A"/>
                 <w:sz w:val="22"/>
                 <w:szCs w:val="22"/>
               </w:rPr>
@@ -2002,29 +2018,31 @@
         </w:tc>
         <w:tc>
           <w:tcPr>
-            <w:tcW w:type="dxa" w:w="1900"/>
-            <w:tcBorders>
-              <w:top w:val="single" w:color="7A869E" w:sz="8"/>
-              <w:left w:val="single" w:color="7A869E" w:sz="8"/>
-              <w:bottom w:val="single" w:color="7A869E" w:sz="8"/>
-              <w:right w:val="single" w:color="7A869E" w:sz="8"/>
-            </w:tcBorders>
-            <w:tcMar>
-              <w:top w:type="dxa" w:w="50"/>
-              <w:left w:type="dxa" w:w="90"/>
-              <w:bottom w:type="dxa" w:w="50"/>
-              <w:right w:type="dxa" w:w="100"/>
-            </w:tcMar>
-            <w:vAlign w:val="center"/>
-          </w:tcPr>
-          <w:p>
-            <w:pPr>
-              <w:spacing w:after="0" w:before="0"/>
-            </w:pPr>
-            <w:r>
-              <w:rPr>
-                <w:rFonts w:ascii="Calibri" w:cs="Calibri" w:eastAsia="Calibri" w:hAnsi="Calibri"/>
-                <w:color w:val="000000"/>
+            <w:tcW w:type="dxa" w:w="2500"/>
+            <w:tcBorders>
+              <w:top w:val="single" w:color="7A869E" w:sz="8"/>
+              <w:left w:val="single" w:color="7A869E" w:sz="8"/>
+              <w:bottom w:val="single" w:color="7A869E" w:sz="8"/>
+              <w:right w:val="single" w:color="7A869E" w:sz="8"/>
+            </w:tcBorders>
+            <w:tcMar>
+              <w:top w:type="dxa" w:w="50"/>
+              <w:left w:type="dxa" w:w="90"/>
+              <w:bottom w:type="dxa" w:w="50"/>
+              <w:right w:type="dxa" w:w="100"/>
+            </w:tcMar>
+            <w:vAlign w:val="center"/>
+          </w:tcPr>
+          <w:p>
+            <w:pPr>
+              <w:spacing w:after="0" w:before="0"/>
+            </w:pPr>
+            <w:r>
+              <w:rPr>
+                <w:rFonts w:ascii="Calibri" w:cs="Calibri" w:eastAsia="Calibri" w:hAnsi="Calibri"/>
+                <w:i/>
+                <w:iCs/>
+                <w:color w:val="1E7B4A"/>
                 <w:sz w:val="22"/>
                 <w:szCs w:val="22"/>
               </w:rPr>
@@ -2112,29 +2130,31 @@
         </w:tc>
         <w:tc>
           <w:tcPr>
-            <w:tcW w:type="dxa" w:w="1900"/>
-            <w:tcBorders>
-              <w:top w:val="single" w:color="7A869E" w:sz="8"/>
-              <w:left w:val="single" w:color="7A869E" w:sz="8"/>
-              <w:bottom w:val="single" w:color="7A869E" w:sz="8"/>
-              <w:right w:val="single" w:color="7A869E" w:sz="8"/>
-            </w:tcBorders>
-            <w:tcMar>
-              <w:top w:type="dxa" w:w="50"/>
-              <w:left w:type="dxa" w:w="90"/>
-              <w:bottom w:type="dxa" w:w="50"/>
-              <w:right w:type="dxa" w:w="100"/>
-            </w:tcMar>
-            <w:vAlign w:val="center"/>
-          </w:tcPr>
-          <w:p>
-            <w:pPr>
-              <w:spacing w:after="0" w:before="0"/>
-            </w:pPr>
-            <w:r>
-              <w:rPr>
-                <w:rFonts w:ascii="Calibri" w:cs="Calibri" w:eastAsia="Calibri" w:hAnsi="Calibri"/>
-                <w:color w:val="000000"/>
+            <w:tcW w:type="dxa" w:w="1500"/>
+            <w:tcBorders>
+              <w:top w:val="single" w:color="7A869E" w:sz="8"/>
+              <w:left w:val="single" w:color="7A869E" w:sz="8"/>
+              <w:bottom w:val="single" w:color="7A869E" w:sz="8"/>
+              <w:right w:val="single" w:color="7A869E" w:sz="8"/>
+            </w:tcBorders>
+            <w:tcMar>
+              <w:top w:type="dxa" w:w="50"/>
+              <w:left w:type="dxa" w:w="90"/>
+              <w:bottom w:type="dxa" w:w="50"/>
+              <w:right w:type="dxa" w:w="100"/>
+            </w:tcMar>
+            <w:vAlign w:val="center"/>
+          </w:tcPr>
+          <w:p>
+            <w:pPr>
+              <w:spacing w:after="0" w:before="0"/>
+            </w:pPr>
+            <w:r>
+              <w:rPr>
+                <w:rFonts w:ascii="Calibri" w:cs="Calibri" w:eastAsia="Calibri" w:hAnsi="Calibri"/>
+                <w:i/>
+                <w:iCs/>
+                <w:color w:val="1E7B4A"/>
                 <w:sz w:val="22"/>
                 <w:szCs w:val="22"/>
               </w:rPr>
@@ -2144,29 +2164,31 @@
         </w:tc>
         <w:tc>
           <w:tcPr>
-            <w:tcW w:type="dxa" w:w="1900"/>
-            <w:tcBorders>
-              <w:top w:val="single" w:color="7A869E" w:sz="8"/>
-              <w:left w:val="single" w:color="7A869E" w:sz="8"/>
-              <w:bottom w:val="single" w:color="7A869E" w:sz="8"/>
-              <w:right w:val="single" w:color="7A869E" w:sz="8"/>
-            </w:tcBorders>
-            <w:tcMar>
-              <w:top w:type="dxa" w:w="50"/>
-              <w:left w:type="dxa" w:w="90"/>
-              <w:bottom w:type="dxa" w:w="50"/>
-              <w:right w:type="dxa" w:w="100"/>
-            </w:tcMar>
-            <w:vAlign w:val="center"/>
-          </w:tcPr>
-          <w:p>
-            <w:pPr>
-              <w:spacing w:after="0" w:before="0"/>
-            </w:pPr>
-            <w:r>
-              <w:rPr>
-                <w:rFonts w:ascii="Calibri" w:cs="Calibri" w:eastAsia="Calibri" w:hAnsi="Calibri"/>
-                <w:color w:val="000000"/>
+            <w:tcW w:type="dxa" w:w="1700"/>
+            <w:tcBorders>
+              <w:top w:val="single" w:color="7A869E" w:sz="8"/>
+              <w:left w:val="single" w:color="7A869E" w:sz="8"/>
+              <w:bottom w:val="single" w:color="7A869E" w:sz="8"/>
+              <w:right w:val="single" w:color="7A869E" w:sz="8"/>
+            </w:tcBorders>
+            <w:tcMar>
+              <w:top w:type="dxa" w:w="50"/>
+              <w:left w:type="dxa" w:w="90"/>
+              <w:bottom w:type="dxa" w:w="50"/>
+              <w:right w:type="dxa" w:w="100"/>
+            </w:tcMar>
+            <w:vAlign w:val="center"/>
+          </w:tcPr>
+          <w:p>
+            <w:pPr>
+              <w:spacing w:after="0" w:before="0"/>
+            </w:pPr>
+            <w:r>
+              <w:rPr>
+                <w:rFonts w:ascii="Calibri" w:cs="Calibri" w:eastAsia="Calibri" w:hAnsi="Calibri"/>
+                <w:i/>
+                <w:iCs/>
+                <w:color w:val="1E7B4A"/>
                 <w:sz w:val="22"/>
                 <w:szCs w:val="22"/>
               </w:rPr>
@@ -2176,29 +2198,31 @@
         </w:tc>
         <w:tc>
           <w:tcPr>
-            <w:tcW w:type="dxa" w:w="1900"/>
-            <w:tcBorders>
-              <w:top w:val="single" w:color="7A869E" w:sz="8"/>
-              <w:left w:val="single" w:color="7A869E" w:sz="8"/>
-              <w:bottom w:val="single" w:color="7A869E" w:sz="8"/>
-              <w:right w:val="single" w:color="7A869E" w:sz="8"/>
-            </w:tcBorders>
-            <w:tcMar>
-              <w:top w:type="dxa" w:w="50"/>
-              <w:left w:type="dxa" w:w="90"/>
-              <w:bottom w:type="dxa" w:w="50"/>
-              <w:right w:type="dxa" w:w="100"/>
-            </w:tcMar>
-            <w:vAlign w:val="center"/>
-          </w:tcPr>
-          <w:p>
-            <w:pPr>
-              <w:spacing w:after="0" w:before="0"/>
-            </w:pPr>
-            <w:r>
-              <w:rPr>
-                <w:rFonts w:ascii="Calibri" w:cs="Calibri" w:eastAsia="Calibri" w:hAnsi="Calibri"/>
-                <w:color w:val="000000"/>
+            <w:tcW w:type="dxa" w:w="2500"/>
+            <w:tcBorders>
+              <w:top w:val="single" w:color="7A869E" w:sz="8"/>
+              <w:left w:val="single" w:color="7A869E" w:sz="8"/>
+              <w:bottom w:val="single" w:color="7A869E" w:sz="8"/>
+              <w:right w:val="single" w:color="7A869E" w:sz="8"/>
+            </w:tcBorders>
+            <w:tcMar>
+              <w:top w:type="dxa" w:w="50"/>
+              <w:left w:type="dxa" w:w="90"/>
+              <w:bottom w:type="dxa" w:w="50"/>
+              <w:right w:type="dxa" w:w="100"/>
+            </w:tcMar>
+            <w:vAlign w:val="center"/>
+          </w:tcPr>
+          <w:p>
+            <w:pPr>
+              <w:spacing w:after="0" w:before="0"/>
+            </w:pPr>
+            <w:r>
+              <w:rPr>
+                <w:rFonts w:ascii="Calibri" w:cs="Calibri" w:eastAsia="Calibri" w:hAnsi="Calibri"/>
+                <w:i/>
+                <w:iCs/>
+                <w:color w:val="1E7B4A"/>
                 <w:sz w:val="22"/>
                 <w:szCs w:val="22"/>
               </w:rPr>
@@ -2412,16 +2436,18 @@
               <w:bottom w:type="dxa" w:w="60"/>
               <w:right w:type="dxa" w:w="100"/>
             </w:tcMar>
-            <w:vAlign w:val="center"/>
-          </w:tcPr>
-          <w:p>
-            <w:pPr>
-              <w:spacing w:after="0" w:before="0"/>
-            </w:pPr>
-            <w:r>
-              <w:rPr>
-                <w:rFonts w:ascii="Calibri" w:cs="Calibri" w:eastAsia="Calibri" w:hAnsi="Calibri"/>
-                <w:color w:val="000000"/>
+            <w:vAlign w:val="bottom"/>
+          </w:tcPr>
+          <w:p>
+            <w:pPr>
+              <w:spacing w:after="0" w:before="0"/>
+            </w:pPr>
+            <w:r>
+              <w:rPr>
+                <w:rFonts w:ascii="Calibri" w:cs="Calibri" w:eastAsia="Calibri" w:hAnsi="Calibri"/>
+                <w:i/>
+                <w:iCs/>
+                <w:color w:val="1E7B4A"/>
                 <w:sz w:val="22"/>
                 <w:szCs w:val="22"/>
               </w:rPr>
@@ -2501,16 +2527,18 @@
               <w:bottom w:type="dxa" w:w="60"/>
               <w:right w:type="dxa" w:w="100"/>
             </w:tcMar>
-            <w:vAlign w:val="center"/>
-          </w:tcPr>
-          <w:p>
-            <w:pPr>
-              <w:spacing w:after="0" w:before="0"/>
-            </w:pPr>
-            <w:r>
-              <w:rPr>
-                <w:rFonts w:ascii="Calibri" w:cs="Calibri" w:eastAsia="Calibri" w:hAnsi="Calibri"/>
-                <w:color w:val="000000"/>
+            <w:vAlign w:val="bottom"/>
+          </w:tcPr>
+          <w:p>
+            <w:pPr>
+              <w:spacing w:after="0" w:before="0"/>
+            </w:pPr>
+            <w:r>
+              <w:rPr>
+                <w:rFonts w:ascii="Calibri" w:cs="Calibri" w:eastAsia="Calibri" w:hAnsi="Calibri"/>
+                <w:i/>
+                <w:iCs/>
+                <w:color w:val="1E7B4A"/>
                 <w:sz w:val="22"/>
                 <w:szCs w:val="22"/>
               </w:rPr>
@@ -2590,16 +2618,18 @@
               <w:bottom w:type="dxa" w:w="60"/>
               <w:right w:type="dxa" w:w="100"/>
             </w:tcMar>
-            <w:vAlign w:val="center"/>
-          </w:tcPr>
-          <w:p>
-            <w:pPr>
-              <w:spacing w:after="0" w:before="0"/>
-            </w:pPr>
-            <w:r>
-              <w:rPr>
-                <w:rFonts w:ascii="Calibri" w:cs="Calibri" w:eastAsia="Calibri" w:hAnsi="Calibri"/>
-                <w:color w:val="000000"/>
+            <w:vAlign w:val="bottom"/>
+          </w:tcPr>
+          <w:p>
+            <w:pPr>
+              <w:spacing w:after="0" w:before="0"/>
+            </w:pPr>
+            <w:r>
+              <w:rPr>
+                <w:rFonts w:ascii="Calibri" w:cs="Calibri" w:eastAsia="Calibri" w:hAnsi="Calibri"/>
+                <w:i/>
+                <w:iCs/>
+                <w:color w:val="1E7B4A"/>
                 <w:sz w:val="22"/>
                 <w:szCs w:val="22"/>
               </w:rPr>
@@ -2679,16 +2709,18 @@
               <w:bottom w:type="dxa" w:w="60"/>
               <w:right w:type="dxa" w:w="100"/>
             </w:tcMar>
-            <w:vAlign w:val="center"/>
-          </w:tcPr>
-          <w:p>
-            <w:pPr>
-              <w:spacing w:after="0" w:before="0"/>
-            </w:pPr>
-            <w:r>
-              <w:rPr>
-                <w:rFonts w:ascii="Calibri" w:cs="Calibri" w:eastAsia="Calibri" w:hAnsi="Calibri"/>
-                <w:color w:val="000000"/>
+            <w:vAlign w:val="bottom"/>
+          </w:tcPr>
+          <w:p>
+            <w:pPr>
+              <w:spacing w:after="0" w:before="0"/>
+            </w:pPr>
+            <w:r>
+              <w:rPr>
+                <w:rFonts w:ascii="Calibri" w:cs="Calibri" w:eastAsia="Calibri" w:hAnsi="Calibri"/>
+                <w:i/>
+                <w:iCs/>
+                <w:color w:val="1E7B4A"/>
                 <w:sz w:val="22"/>
                 <w:szCs w:val="22"/>
               </w:rPr>
@@ -2805,16 +2837,18 @@
               <w:bottom w:type="dxa" w:w="60"/>
               <w:right w:type="dxa" w:w="100"/>
             </w:tcMar>
-            <w:vAlign w:val="center"/>
-          </w:tcPr>
-          <w:p>
-            <w:pPr>
-              <w:spacing w:after="0" w:before="0"/>
-            </w:pPr>
-            <w:r>
-              <w:rPr>
-                <w:rFonts w:ascii="Calibri" w:cs="Calibri" w:eastAsia="Calibri" w:hAnsi="Calibri"/>
-                <w:color w:val="000000"/>
+            <w:vAlign w:val="bottom"/>
+          </w:tcPr>
+          <w:p>
+            <w:pPr>
+              <w:spacing w:after="0" w:before="0"/>
+            </w:pPr>
+            <w:r>
+              <w:rPr>
+                <w:rFonts w:ascii="Calibri" w:cs="Calibri" w:eastAsia="Calibri" w:hAnsi="Calibri"/>
+                <w:i/>
+                <w:iCs/>
+                <w:color w:val="1E7B4A"/>
                 <w:sz w:val="22"/>
                 <w:szCs w:val="22"/>
               </w:rPr>
@@ -2894,16 +2928,18 @@
               <w:bottom w:type="dxa" w:w="60"/>
               <w:right w:type="dxa" w:w="100"/>
             </w:tcMar>
-            <w:vAlign w:val="center"/>
-          </w:tcPr>
-          <w:p>
-            <w:pPr>
-              <w:spacing w:after="0" w:before="0"/>
-            </w:pPr>
-            <w:r>
-              <w:rPr>
-                <w:rFonts w:ascii="Calibri" w:cs="Calibri" w:eastAsia="Calibri" w:hAnsi="Calibri"/>
-                <w:color w:val="000000"/>
+            <w:vAlign w:val="bottom"/>
+          </w:tcPr>
+          <w:p>
+            <w:pPr>
+              <w:spacing w:after="0" w:before="0"/>
+            </w:pPr>
+            <w:r>
+              <w:rPr>
+                <w:rFonts w:ascii="Calibri" w:cs="Calibri" w:eastAsia="Calibri" w:hAnsi="Calibri"/>
+                <w:i/>
+                <w:iCs/>
+                <w:color w:val="1E7B4A"/>
                 <w:sz w:val="22"/>
                 <w:szCs w:val="22"/>
               </w:rPr>
@@ -2983,16 +3019,18 @@
               <w:bottom w:type="dxa" w:w="60"/>
               <w:right w:type="dxa" w:w="100"/>
             </w:tcMar>
-            <w:vAlign w:val="center"/>
-          </w:tcPr>
-          <w:p>
-            <w:pPr>
-              <w:spacing w:after="0" w:before="0"/>
-            </w:pPr>
-            <w:r>
-              <w:rPr>
-                <w:rFonts w:ascii="Calibri" w:cs="Calibri" w:eastAsia="Calibri" w:hAnsi="Calibri"/>
-                <w:color w:val="000000"/>
+            <w:vAlign w:val="bottom"/>
+          </w:tcPr>
+          <w:p>
+            <w:pPr>
+              <w:spacing w:after="0" w:before="0"/>
+            </w:pPr>
+            <w:r>
+              <w:rPr>
+                <w:rFonts w:ascii="Calibri" w:cs="Calibri" w:eastAsia="Calibri" w:hAnsi="Calibri"/>
+                <w:i/>
+                <w:iCs/>
+                <w:color w:val="1E7B4A"/>
                 <w:sz w:val="22"/>
                 <w:szCs w:val="22"/>
               </w:rPr>
@@ -3072,16 +3110,18 @@
               <w:bottom w:type="dxa" w:w="60"/>
               <w:right w:type="dxa" w:w="100"/>
             </w:tcMar>
-            <w:vAlign w:val="center"/>
-          </w:tcPr>
-          <w:p>
-            <w:pPr>
-              <w:spacing w:after="0" w:before="0"/>
-            </w:pPr>
-            <w:r>
-              <w:rPr>
-                <w:rFonts w:ascii="Calibri" w:cs="Calibri" w:eastAsia="Calibri" w:hAnsi="Calibri"/>
-                <w:color w:val="000000"/>
+            <w:vAlign w:val="bottom"/>
+          </w:tcPr>
+          <w:p>
+            <w:pPr>
+              <w:spacing w:after="0" w:before="0"/>
+            </w:pPr>
+            <w:r>
+              <w:rPr>
+                <w:rFonts w:ascii="Calibri" w:cs="Calibri" w:eastAsia="Calibri" w:hAnsi="Calibri"/>
+                <w:i/>
+                <w:iCs/>
+                <w:color w:val="1E7B4A"/>
                 <w:sz w:val="22"/>
                 <w:szCs w:val="22"/>
               </w:rPr>
@@ -3495,16 +3535,18 @@
               <w:bottom w:type="dxa" w:w="60"/>
               <w:right w:type="dxa" w:w="100"/>
             </w:tcMar>
-            <w:vAlign w:val="center"/>
-          </w:tcPr>
-          <w:p>
-            <w:pPr>
-              <w:spacing w:after="0" w:before="0"/>
-            </w:pPr>
-            <w:r>
-              <w:rPr>
-                <w:rFonts w:ascii="Calibri" w:cs="Calibri" w:eastAsia="Calibri" w:hAnsi="Calibri"/>
-                <w:color w:val="000000"/>
+            <w:vAlign w:val="bottom"/>
+          </w:tcPr>
+          <w:p>
+            <w:pPr>
+              <w:spacing w:after="0" w:before="0"/>
+            </w:pPr>
+            <w:r>
+              <w:rPr>
+                <w:rFonts w:ascii="Calibri" w:cs="Calibri" w:eastAsia="Calibri" w:hAnsi="Calibri"/>
+                <w:i/>
+                <w:iCs/>
+                <w:color w:val="1E7B4A"/>
                 <w:sz w:val="22"/>
                 <w:szCs w:val="22"/>
               </w:rPr>

</xml_diff>